<commit_message>
Research: Abakelia digest; bestiary devi updated from Kiknadze; PDF/DOCX exports
Co-Authored-By: Claude Opus 5.5 <noreply@anthropic.com>
Claude-Session: https://claude.ai/code/session_01TUhCpmyEuwXm7rGtZgfP6r
</commit_message>
<xml_diff>
--- a/exports/09-bestiariy.docx
+++ b/exports/09-bestiariy.docx
@@ -212,6 +212,155 @@
           <w:bCs/>
           <w:b/>
         </w:rPr>
+        <w:t xml:space="preserve">По Кикнадзе</w:t>
+      </w:r>
+      <w:r>
+        <w:t xml:space="preserve"> </w:t>
+      </w:r>
+      <w:r>
+        <w:t xml:space="preserve">(горные предания):</w:t>
+      </w:r>
+    </w:p>
+    <w:p>
+      <w:pPr>
+        <w:numPr>
+          <w:ilvl w:val="0"/>
+          <w:numId w:val="1002"/>
+        </w:numPr>
+        <w:pStyle w:val="Compact"/>
+      </w:pPr>
+      <w:r>
+        <w:t xml:space="preserve">«Лицо человечье, шерстью обросли, одежды нет,</w:t>
+      </w:r>
+      <w:r>
+        <w:t xml:space="preserve"> </w:t>
+      </w:r>
+      <w:r>
+        <w:rPr>
+          <w:bCs/>
+          <w:b/>
+        </w:rPr>
+        <w:t xml:space="preserve">ноги повёрнуты задом наперёд</w:t>
+      </w:r>
+      <w:r>
+        <w:t xml:space="preserve">» ✦.</w:t>
+      </w:r>
+    </w:p>
+    <w:p>
+      <w:pPr>
+        <w:numPr>
+          <w:ilvl w:val="0"/>
+          <w:numId w:val="1002"/>
+        </w:numPr>
+        <w:pStyle w:val="Compact"/>
+      </w:pPr>
+      <w:r>
+        <w:t xml:space="preserve">Деви —</w:t>
+      </w:r>
+      <w:r>
+        <w:t xml:space="preserve"> </w:t>
+      </w:r>
+      <w:r>
+        <w:rPr>
+          <w:bCs/>
+          <w:b/>
+        </w:rPr>
+        <w:t xml:space="preserve">кузнецы</w:t>
+      </w:r>
+      <w:r>
+        <w:t xml:space="preserve">, единственные, кто знает тайну железа. Людям они куют волшебные плуги, а в уплату берут</w:t>
+      </w:r>
+      <w:r>
+        <w:t xml:space="preserve"> </w:t>
+      </w:r>
+      <w:r>
+        <w:rPr>
+          <w:bCs/>
+          <w:b/>
+        </w:rPr>
+        <w:t xml:space="preserve">женщин</w:t>
+      </w:r>
+      <w:r>
+        <w:t xml:space="preserve"> </w:t>
+      </w:r>
+      <w:r>
+        <w:t xml:space="preserve">✦.</w:t>
+      </w:r>
+    </w:p>
+    <w:p>
+      <w:pPr>
+        <w:numPr>
+          <w:ilvl w:val="0"/>
+          <w:numId w:val="1002"/>
+        </w:numPr>
+        <w:pStyle w:val="Compact"/>
+      </w:pPr>
+      <w:r>
+        <w:t xml:space="preserve">При этом</w:t>
+      </w:r>
+      <w:r>
+        <w:t xml:space="preserve"> </w:t>
+      </w:r>
+      <w:r>
+        <w:rPr>
+          <w:bCs/>
+          <w:b/>
+        </w:rPr>
+        <w:t xml:space="preserve">сами коснуться железа не могут</w:t>
+      </w:r>
+      <w:r>
+        <w:t xml:space="preserve"> </w:t>
+      </w:r>
+      <w:r>
+        <w:t xml:space="preserve">✦.</w:t>
+      </w:r>
+    </w:p>
+    <w:p>
+      <w:pPr>
+        <w:numPr>
+          <w:ilvl w:val="0"/>
+          <w:numId w:val="1002"/>
+        </w:numPr>
+        <w:pStyle w:val="Compact"/>
+      </w:pPr>
+      <w:r>
+        <w:t xml:space="preserve">Отсюда правило:</w:t>
+      </w:r>
+      <w:r>
+        <w:t xml:space="preserve"> </w:t>
+      </w:r>
+      <w:r>
+        <w:rPr>
+          <w:bCs/>
+          <w:b/>
+        </w:rPr>
+        <w:t xml:space="preserve">железо жжёт деви</w:t>
+      </w:r>
+      <w:r>
+        <w:t xml:space="preserve">.</w:t>
+      </w:r>
+    </w:p>
+    <w:p>
+      <w:pPr>
+        <w:numPr>
+          <w:ilvl w:val="0"/>
+          <w:numId w:val="1002"/>
+        </w:numPr>
+        <w:pStyle w:val="Compact"/>
+      </w:pPr>
+      <w:r>
+        <w:t xml:space="preserve">И для сюжета: Мирандухт — та самая «плата женщиной».</w:t>
+      </w:r>
+    </w:p>
+    <w:p>
+      <w:pPr>
+        <w:pStyle w:val="FirstParagraph"/>
+      </w:pPr>
+      <w:r>
+        <w:rPr>
+          <w:bCs/>
+          <w:b/>
+        </w:rPr>
         <w:t xml:space="preserve">Повадки.</w:t>
       </w:r>
     </w:p>
@@ -219,7 +368,7 @@
       <w:pPr>
         <w:numPr>
           <w:ilvl w:val="0"/>
-          <w:numId w:val="1002"/>
+          <w:numId w:val="1003"/>
         </w:numPr>
         <w:pStyle w:val="Compact"/>
       </w:pPr>
@@ -231,7 +380,7 @@
       <w:pPr>
         <w:numPr>
           <w:ilvl w:val="0"/>
-          <w:numId w:val="1002"/>
+          <w:numId w:val="1003"/>
         </w:numPr>
         <w:pStyle w:val="Compact"/>
       </w:pPr>
@@ -243,7 +392,7 @@
       <w:pPr>
         <w:numPr>
           <w:ilvl w:val="0"/>
-          <w:numId w:val="1002"/>
+          <w:numId w:val="1003"/>
         </w:numPr>
         <w:pStyle w:val="Compact"/>
       </w:pPr>
@@ -255,7 +404,7 @@
       <w:pPr>
         <w:numPr>
           <w:ilvl w:val="0"/>
-          <w:numId w:val="1002"/>
+          <w:numId w:val="1003"/>
         </w:numPr>
         <w:pStyle w:val="Compact"/>
       </w:pPr>
@@ -277,7 +426,7 @@
       <w:pPr>
         <w:numPr>
           <w:ilvl w:val="0"/>
-          <w:numId w:val="1002"/>
+          <w:numId w:val="1003"/>
         </w:numPr>
         <w:pStyle w:val="Compact"/>
       </w:pPr>
@@ -317,7 +466,7 @@
       <w:pPr>
         <w:numPr>
           <w:ilvl w:val="0"/>
-          <w:numId w:val="1003"/>
+          <w:numId w:val="1004"/>
         </w:numPr>
         <w:pStyle w:val="Compact"/>
       </w:pPr>
@@ -345,7 +494,7 @@
       <w:pPr>
         <w:numPr>
           <w:ilvl w:val="0"/>
-          <w:numId w:val="1003"/>
+          <w:numId w:val="1004"/>
         </w:numPr>
         <w:pStyle w:val="Compact"/>
       </w:pPr>
@@ -357,7 +506,7 @@
       <w:pPr>
         <w:numPr>
           <w:ilvl w:val="0"/>
-          <w:numId w:val="1003"/>
+          <w:numId w:val="1004"/>
         </w:numPr>
         <w:pStyle w:val="Compact"/>
       </w:pPr>
@@ -367,6 +516,28 @@
     </w:p>
     <w:p>
       <w:pPr>
+        <w:numPr>
+          <w:ilvl w:val="0"/>
+          <w:numId w:val="1004"/>
+        </w:numPr>
+        <w:pStyle w:val="Compact"/>
+      </w:pPr>
+      <w:r>
+        <w:rPr>
+          <w:bCs/>
+          <w:b/>
+        </w:rPr>
+        <w:t xml:space="preserve">Железо</w:t>
+      </w:r>
+      <w:r>
+        <w:t xml:space="preserve"> </w:t>
+      </w:r>
+      <w:r>
+        <w:t xml:space="preserve">ранит деви. Деви не смеют войти в святилище-«амбар» своего джвари ✦.</w:t>
+      </w:r>
+    </w:p>
+    <w:p>
+      <w:pPr>
         <w:pStyle w:val="FirstParagraph"/>
       </w:pPr>
       <w:r>
@@ -453,7 +624,7 @@
         <w:rPr>
           <w:rStyle w:val="VerbatimChar"/>
         </w:rPr>
-        <w:t xml:space="preserve">Creature concept sheet of a Devi, a horned giant from Georgian mythology: about five meters tall, hairy and heavy, three heads growing from one massive neck-and-shoulder mass, each head with long curved ram horns, matted dark hair, heavy brow and tusk-like teeth. Crude bronze cuffs, a belt hung with gold torques and plundered treasure. On one neck a fresh stump where a new small head is budding out of raw flesh. Full body in front and three-quarter view, plus a close-up of the regrowing head, and a human warrior figure for scale. Variant in the corner: the elder Devi Tsalrka, with a single massive horn in the middle of his forehead. Neutral dark grey background.</w:t>
+        <w:t xml:space="preserve">Creature concept sheet of a Devi, a horned giant from Georgian mythology: about five meters tall, hairy and heavy, three heads growing from one massive neck-and-shoulder mass, each head with long curved ram horns, matted dark hair, heavy brow and tusk-like teeth, faces disturbingly human under the fur. His feet are turned backwards, heels pointing forward. Crude bronze cuffs, a belt hung with gold torques and plundered treasure. On one neck a fresh stump where a new small head is budding out of raw flesh. Full body in front and three-quarter view, plus a close-up of the regrowing head, and a human warrior figure for scale. Variant in the corner: the elder Devi Tsalrka, with a single massive horn in the middle of his forehead. Neutral dark grey background.</w:t>
       </w:r>
       <w:r>
         <w:br/>
@@ -588,7 +759,7 @@
       <w:pPr>
         <w:numPr>
           <w:ilvl w:val="0"/>
-          <w:numId w:val="1004"/>
+          <w:numId w:val="1005"/>
         </w:numPr>
         <w:pStyle w:val="Compact"/>
       </w:pPr>
@@ -607,7 +778,7 @@
       <w:pPr>
         <w:numPr>
           <w:ilvl w:val="0"/>
-          <w:numId w:val="1004"/>
+          <w:numId w:val="1005"/>
         </w:numPr>
         <w:pStyle w:val="Compact"/>
       </w:pPr>
@@ -626,7 +797,7 @@
       <w:pPr>
         <w:numPr>
           <w:ilvl w:val="0"/>
-          <w:numId w:val="1004"/>
+          <w:numId w:val="1005"/>
         </w:numPr>
         <w:pStyle w:val="Compact"/>
       </w:pPr>
@@ -694,7 +865,7 @@
       <w:pPr>
         <w:numPr>
           <w:ilvl w:val="0"/>
-          <w:numId w:val="1005"/>
+          <w:numId w:val="1006"/>
         </w:numPr>
         <w:pStyle w:val="Compact"/>
       </w:pPr>
@@ -729,7 +900,7 @@
       <w:pPr>
         <w:numPr>
           <w:ilvl w:val="0"/>
-          <w:numId w:val="1005"/>
+          <w:numId w:val="1006"/>
         </w:numPr>
         <w:pStyle w:val="Compact"/>
       </w:pPr>
@@ -770,7 +941,7 @@
       <w:pPr>
         <w:numPr>
           <w:ilvl w:val="0"/>
-          <w:numId w:val="1005"/>
+          <w:numId w:val="1006"/>
         </w:numPr>
         <w:pStyle w:val="Compact"/>
       </w:pPr>
@@ -782,7 +953,7 @@
       <w:pPr>
         <w:numPr>
           <w:ilvl w:val="0"/>
-          <w:numId w:val="1005"/>
+          <w:numId w:val="1006"/>
         </w:numPr>
         <w:pStyle w:val="Compact"/>
       </w:pPr>
@@ -941,7 +1112,7 @@
       <w:pPr>
         <w:numPr>
           <w:ilvl w:val="0"/>
-          <w:numId w:val="1006"/>
+          <w:numId w:val="1007"/>
         </w:numPr>
         <w:pStyle w:val="Compact"/>
       </w:pPr>
@@ -963,7 +1134,7 @@
       <w:pPr>
         <w:numPr>
           <w:ilvl w:val="0"/>
-          <w:numId w:val="1006"/>
+          <w:numId w:val="1007"/>
         </w:numPr>
         <w:pStyle w:val="Compact"/>
       </w:pPr>
@@ -1060,7 +1231,7 @@
       <w:pPr>
         <w:numPr>
           <w:ilvl w:val="0"/>
-          <w:numId w:val="1007"/>
+          <w:numId w:val="1008"/>
         </w:numPr>
         <w:pStyle w:val="Compact"/>
       </w:pPr>
@@ -1088,7 +1259,7 @@
       <w:pPr>
         <w:numPr>
           <w:ilvl w:val="0"/>
-          <w:numId w:val="1007"/>
+          <w:numId w:val="1008"/>
         </w:numPr>
         <w:pStyle w:val="Compact"/>
       </w:pPr>
@@ -1112,7 +1283,7 @@
       <w:pPr>
         <w:numPr>
           <w:ilvl w:val="0"/>
-          <w:numId w:val="1008"/>
+          <w:numId w:val="1009"/>
         </w:numPr>
         <w:pStyle w:val="Compact"/>
       </w:pPr>
@@ -1147,7 +1318,7 @@
       <w:pPr>
         <w:numPr>
           <w:ilvl w:val="0"/>
-          <w:numId w:val="1008"/>
+          <w:numId w:val="1009"/>
         </w:numPr>
         <w:pStyle w:val="Compact"/>
       </w:pPr>
@@ -1159,7 +1330,7 @@
       <w:pPr>
         <w:numPr>
           <w:ilvl w:val="0"/>
-          <w:numId w:val="1008"/>
+          <w:numId w:val="1009"/>
         </w:numPr>
         <w:pStyle w:val="Compact"/>
       </w:pPr>
@@ -1350,7 +1521,7 @@
       <w:pPr>
         <w:numPr>
           <w:ilvl w:val="0"/>
-          <w:numId w:val="1009"/>
+          <w:numId w:val="1010"/>
         </w:numPr>
         <w:pStyle w:val="Compact"/>
       </w:pPr>
@@ -1372,7 +1543,7 @@
       <w:pPr>
         <w:numPr>
           <w:ilvl w:val="0"/>
-          <w:numId w:val="1009"/>
+          <w:numId w:val="1010"/>
         </w:numPr>
         <w:pStyle w:val="Compact"/>
       </w:pPr>
@@ -1396,7 +1567,7 @@
       <w:pPr>
         <w:numPr>
           <w:ilvl w:val="0"/>
-          <w:numId w:val="1010"/>
+          <w:numId w:val="1011"/>
         </w:numPr>
         <w:pStyle w:val="Compact"/>
       </w:pPr>
@@ -1424,7 +1595,7 @@
       <w:pPr>
         <w:numPr>
           <w:ilvl w:val="0"/>
-          <w:numId w:val="1010"/>
+          <w:numId w:val="1011"/>
         </w:numPr>
         <w:pStyle w:val="Compact"/>
       </w:pPr>
@@ -1606,7 +1777,7 @@
       <w:pPr>
         <w:numPr>
           <w:ilvl w:val="0"/>
-          <w:numId w:val="1011"/>
+          <w:numId w:val="1012"/>
         </w:numPr>
         <w:pStyle w:val="Compact"/>
       </w:pPr>
@@ -1625,7 +1796,7 @@
       <w:pPr>
         <w:numPr>
           <w:ilvl w:val="0"/>
-          <w:numId w:val="1011"/>
+          <w:numId w:val="1012"/>
         </w:numPr>
         <w:pStyle w:val="Compact"/>
       </w:pPr>
@@ -1663,7 +1834,7 @@
       <w:pPr>
         <w:numPr>
           <w:ilvl w:val="0"/>
-          <w:numId w:val="1011"/>
+          <w:numId w:val="1012"/>
         </w:numPr>
         <w:pStyle w:val="Compact"/>
       </w:pPr>
@@ -1685,7 +1856,7 @@
       <w:pPr>
         <w:numPr>
           <w:ilvl w:val="0"/>
-          <w:numId w:val="1011"/>
+          <w:numId w:val="1012"/>
         </w:numPr>
         <w:pStyle w:val="Compact"/>
       </w:pPr>
@@ -1901,7 +2072,7 @@
       <w:pPr>
         <w:numPr>
           <w:ilvl w:val="0"/>
-          <w:numId w:val="1012"/>
+          <w:numId w:val="1013"/>
         </w:numPr>
         <w:pStyle w:val="Compact"/>
       </w:pPr>
@@ -1923,7 +2094,7 @@
       <w:pPr>
         <w:numPr>
           <w:ilvl w:val="0"/>
-          <w:numId w:val="1012"/>
+          <w:numId w:val="1013"/>
         </w:numPr>
         <w:pStyle w:val="Compact"/>
       </w:pPr>
@@ -1951,7 +2122,7 @@
       <w:pPr>
         <w:numPr>
           <w:ilvl w:val="0"/>
-          <w:numId w:val="1012"/>
+          <w:numId w:val="1013"/>
         </w:numPr>
         <w:pStyle w:val="Compact"/>
       </w:pPr>
@@ -1991,7 +2162,7 @@
       <w:pPr>
         <w:numPr>
           <w:ilvl w:val="0"/>
-          <w:numId w:val="1013"/>
+          <w:numId w:val="1014"/>
         </w:numPr>
         <w:pStyle w:val="Compact"/>
       </w:pPr>
@@ -2013,7 +2184,7 @@
       <w:pPr>
         <w:numPr>
           <w:ilvl w:val="0"/>
-          <w:numId w:val="1013"/>
+          <w:numId w:val="1014"/>
         </w:numPr>
         <w:pStyle w:val="Compact"/>
       </w:pPr>
@@ -2191,7 +2362,7 @@
       <w:pPr>
         <w:numPr>
           <w:ilvl w:val="0"/>
-          <w:numId w:val="1014"/>
+          <w:numId w:val="1015"/>
         </w:numPr>
         <w:pStyle w:val="Compact"/>
       </w:pPr>
@@ -2203,7 +2374,7 @@
       <w:pPr>
         <w:numPr>
           <w:ilvl w:val="0"/>
-          <w:numId w:val="1014"/>
+          <w:numId w:val="1015"/>
         </w:numPr>
         <w:pStyle w:val="Compact"/>
       </w:pPr>
@@ -2215,7 +2386,7 @@
       <w:pPr>
         <w:numPr>
           <w:ilvl w:val="0"/>
-          <w:numId w:val="1014"/>
+          <w:numId w:val="1015"/>
         </w:numPr>
         <w:pStyle w:val="Compact"/>
       </w:pPr>
@@ -2403,7 +2574,7 @@
       <w:pPr>
         <w:numPr>
           <w:ilvl w:val="0"/>
-          <w:numId w:val="1015"/>
+          <w:numId w:val="1016"/>
         </w:numPr>
         <w:pStyle w:val="Compact"/>
       </w:pPr>
@@ -2422,7 +2593,7 @@
       <w:pPr>
         <w:numPr>
           <w:ilvl w:val="0"/>
-          <w:numId w:val="1015"/>
+          <w:numId w:val="1016"/>
         </w:numPr>
         <w:pStyle w:val="Compact"/>
       </w:pPr>
@@ -2441,7 +2612,7 @@
       <w:pPr>
         <w:numPr>
           <w:ilvl w:val="0"/>
-          <w:numId w:val="1015"/>
+          <w:numId w:val="1016"/>
         </w:numPr>
         <w:pStyle w:val="Compact"/>
       </w:pPr>
@@ -2488,7 +2659,7 @@
       <w:pPr>
         <w:numPr>
           <w:ilvl w:val="0"/>
-          <w:numId w:val="1016"/>
+          <w:numId w:val="1017"/>
         </w:numPr>
         <w:pStyle w:val="Compact"/>
       </w:pPr>
@@ -2526,7 +2697,7 @@
       <w:pPr>
         <w:numPr>
           <w:ilvl w:val="0"/>
-          <w:numId w:val="1016"/>
+          <w:numId w:val="1017"/>
         </w:numPr>
         <w:pStyle w:val="Compact"/>
       </w:pPr>
@@ -2584,7 +2755,7 @@
       <w:pPr>
         <w:numPr>
           <w:ilvl w:val="0"/>
-          <w:numId w:val="1017"/>
+          <w:numId w:val="1018"/>
         </w:numPr>
         <w:pStyle w:val="Compact"/>
       </w:pPr>
@@ -2596,7 +2767,7 @@
       <w:pPr>
         <w:numPr>
           <w:ilvl w:val="0"/>
-          <w:numId w:val="1017"/>
+          <w:numId w:val="1018"/>
         </w:numPr>
         <w:pStyle w:val="Compact"/>
       </w:pPr>
@@ -2608,7 +2779,7 @@
       <w:pPr>
         <w:numPr>
           <w:ilvl w:val="0"/>
-          <w:numId w:val="1017"/>
+          <w:numId w:val="1018"/>
         </w:numPr>
         <w:pStyle w:val="Compact"/>
       </w:pPr>
@@ -2754,7 +2925,7 @@
       <w:pPr>
         <w:numPr>
           <w:ilvl w:val="0"/>
-          <w:numId w:val="1018"/>
+          <w:numId w:val="1019"/>
         </w:numPr>
         <w:pStyle w:val="Compact"/>
       </w:pPr>
@@ -2766,7 +2937,7 @@
       <w:pPr>
         <w:numPr>
           <w:ilvl w:val="0"/>
-          <w:numId w:val="1018"/>
+          <w:numId w:val="1019"/>
         </w:numPr>
         <w:pStyle w:val="Compact"/>
       </w:pPr>
@@ -2788,7 +2959,7 @@
       <w:pPr>
         <w:numPr>
           <w:ilvl w:val="1"/>
-          <w:numId w:val="1019"/>
+          <w:numId w:val="1020"/>
         </w:numPr>
         <w:pStyle w:val="Compact"/>
       </w:pPr>
@@ -2800,7 +2971,7 @@
       <w:pPr>
         <w:numPr>
           <w:ilvl w:val="1"/>
-          <w:numId w:val="1019"/>
+          <w:numId w:val="1020"/>
         </w:numPr>
         <w:pStyle w:val="Compact"/>
       </w:pPr>
@@ -2812,7 +2983,7 @@
       <w:pPr>
         <w:numPr>
           <w:ilvl w:val="1"/>
-          <w:numId w:val="1019"/>
+          <w:numId w:val="1020"/>
         </w:numPr>
         <w:pStyle w:val="Compact"/>
       </w:pPr>
@@ -3111,7 +3282,7 @@
       <w:pPr>
         <w:numPr>
           <w:ilvl w:val="0"/>
-          <w:numId w:val="1020"/>
+          <w:numId w:val="1021"/>
         </w:numPr>
         <w:pStyle w:val="Compact"/>
       </w:pPr>
@@ -3133,7 +3304,7 @@
       <w:pPr>
         <w:numPr>
           <w:ilvl w:val="0"/>
-          <w:numId w:val="1020"/>
+          <w:numId w:val="1021"/>
         </w:numPr>
         <w:pStyle w:val="Compact"/>
       </w:pPr>
@@ -3155,7 +3326,7 @@
       <w:pPr>
         <w:numPr>
           <w:ilvl w:val="0"/>
-          <w:numId w:val="1020"/>
+          <w:numId w:val="1021"/>
         </w:numPr>
         <w:pStyle w:val="Compact"/>
       </w:pPr>
@@ -3177,7 +3348,7 @@
       <w:pPr>
         <w:numPr>
           <w:ilvl w:val="0"/>
-          <w:numId w:val="1020"/>
+          <w:numId w:val="1021"/>
         </w:numPr>
         <w:pStyle w:val="Compact"/>
       </w:pPr>
@@ -3199,7 +3370,7 @@
       <w:pPr>
         <w:numPr>
           <w:ilvl w:val="0"/>
-          <w:numId w:val="1020"/>
+          <w:numId w:val="1021"/>
         </w:numPr>
         <w:pStyle w:val="Compact"/>
       </w:pPr>
@@ -3221,7 +3392,7 @@
       <w:pPr>
         <w:numPr>
           <w:ilvl w:val="0"/>
-          <w:numId w:val="1020"/>
+          <w:numId w:val="1021"/>
         </w:numPr>
         <w:pStyle w:val="Compact"/>
       </w:pPr>
@@ -3243,7 +3414,7 @@
       <w:pPr>
         <w:numPr>
           <w:ilvl w:val="0"/>
-          <w:numId w:val="1020"/>
+          <w:numId w:val="1021"/>
         </w:numPr>
         <w:pStyle w:val="Compact"/>
       </w:pPr>
@@ -3305,7 +3476,7 @@
       <w:pPr>
         <w:numPr>
           <w:ilvl w:val="0"/>
-          <w:numId w:val="1021"/>
+          <w:numId w:val="1022"/>
         </w:numPr>
         <w:pStyle w:val="Compact"/>
       </w:pPr>
@@ -3327,7 +3498,7 @@
       <w:pPr>
         <w:numPr>
           <w:ilvl w:val="0"/>
-          <w:numId w:val="1021"/>
+          <w:numId w:val="1022"/>
         </w:numPr>
         <w:pStyle w:val="Compact"/>
       </w:pPr>
@@ -3601,6 +3772,9 @@
     <w:abstractNumId w:val="991"/>
   </w:num>
   <w:num w:numId="1021">
+    <w:abstractNumId w:val="991"/>
+  </w:num>
+  <w:num w:numId="1022">
     <w:abstractNumId w:val="991"/>
   </w:num>
 </w:numbering>

</xml_diff>